<commit_message>
Profiling Script für space charge kick geschrieben. Konzeptualisierung NO weiter ausgesführt und sortiert
</commit_message>
<xml_diff>
--- a/Quellen/Quellendurchsicht/Li_2021_Fourier Neural Operator for Parametric PDEs.docx
+++ b/Quellen/Quellendurchsicht/Li_2021_Fourier Neural Operator for Parametric PDEs.docx
@@ -229,10 +229,7 @@
         <w:spacing w:after="120" w:line="276" w:lineRule="auto"/>
       </w:pPr>
       <w:r>
-        <w:t>Eine Sache vorweg, weil sie die Lektüre leichter macht: Das Paper ist ein Methodenpapier, kein Anwendungspapier. Es stellt eine Architektur hin und misst sie gegen andere gelernte Verfahren. Deine Arbeit ist der umgekehrte Fall — du hast eine ganz konkrete Rechenstelle in einem bestehenden Programm und suchst das passende Werkzeug dafür. Deshalb sind für dich manche Aussagen zentral, die im Paper nur als Nebensatz auftauchen (allen voran die Differenzierbarkeit auf S. 9), während manches, was dort breit aus</w:t>
-      </w:r>
-      <w:r>
-        <w:t>gewalzt wird, für dich Beiwerk bleibt.</w:t>
+        <w:t>Eine Sache vorweg, weil sie die Lektüre leichter macht: Das Paper ist ein Methodenpapier, kein Anwendungspapier. Es stellt eine Architektur hin und misst sie gegen andere gelernte Verfahren. Deine Arbeit ist der umgekehrte Fall — du hast eine ganz konkrete Rechenstelle in einem bestehenden Programm und suchst das passende Werkzeug dafür. Deshalb sind für dich manche Aussagen zentral, die im Paper nur als Nebensatz auftauchen (allen voran die Differenzierbarkeit auf S. 9), während manches, was dort breit ausgewalzt wird, für dich Beiwerk bleibt.</w:t>
       </w:r>
     </w:p>
     <w:p>
@@ -535,10 +532,7 @@
       </w:r>
       <w:proofErr w:type="spellEnd"/>
       <w:r>
-        <w:t xml:space="preserve"> ist Multiplikation im Frequenzraum, und die FFT mach</w:t>
-      </w:r>
-      <w:r>
-        <w:t>t den Hin- und Rückweg billig. Sie ist ein Beschleuniger, kein Wesensmerkmal.</w:t>
+        <w:t xml:space="preserve"> ist Multiplikation im Frequenzraum, und die FFT macht den Hin- und Rückweg billig. Sie ist ein Beschleuniger, kein Wesensmerkmal.</w:t>
       </w:r>
     </w:p>
     <w:p>
@@ -620,25 +614,7 @@
         <w:spacing w:after="80" w:line="276" w:lineRule="auto"/>
       </w:pPr>
       <w:r>
-        <w:t>Die Formalisierung, die du unter „Verwendete Methoden" schon fast vollständig hattest: D ist ein beschränktes, offenes Gebiet im ℝ</w:t>
-      </w:r>
-      <w:r>
-        <w:t>ᵈ</w:t>
-      </w:r>
-      <w:r>
-        <w:t xml:space="preserve">; </w:t>
-      </w:r>
-      <w:r>
-        <w:t>𝒜</w:t>
-      </w:r>
-      <w:r>
-        <w:t xml:space="preserve"> und </w:t>
-      </w:r>
-      <w:r>
-        <w:t>𝒰</w:t>
-      </w:r>
-      <w:r>
-        <w:t xml:space="preserve"> sind separable Banachräume von Funktionen auf D; der gesuchte Operator G ist in aller Regel nichtlinear; die Daten sind endlich viele Paare, deren Eingänge unabhängig aus einem Wahrscheinlichkeitsmaß µ gezogen werden. Gesucht ist ein Parameter θ aus einem </w:t>
+        <w:t xml:space="preserve">Die Formalisierung, die du unter „Verwendete Methoden" schon fast vollständig hattest: D ist ein beschränktes, offenes Gebiet im ℝᵈ; 𝒜 und 𝒰 sind separable Banachräume von Funktionen auf D; der gesuchte Operator G ist in aller Regel nichtlinear; die Daten sind endlich viele Paare, deren Eingänge unabhängig aus einem Wahrscheinlichkeitsmaß µ gezogen werden. Gesucht ist ein Parameter θ aus einem </w:t>
       </w:r>
       <w:proofErr w:type="spellStart"/>
       <w:r>
@@ -683,14 +659,11 @@
       </w:r>
       <w:proofErr w:type="spellEnd"/>
       <w:r>
-        <w:t xml:space="preserve"> Operator muss eine Antwort u(x) für jed</w:t>
-      </w:r>
-      <w:r>
-        <w:t xml:space="preserve">es x aus D </w:t>
+        <w:t xml:space="preserve"> Operator muss eine Antwort u(x) </w:t>
       </w:r>
       <w:r>
         <w:lastRenderedPageBreak/>
-        <w:t>liefern können, auch für ein x, das in keinem einzigen Trainingsgitter vorkam (S. 4). Genau daran scheitern CNN-Surrogate, und genau deshalb gibt es die Bauform „</w:t>
+        <w:t>für jedes x aus D liefern können, auch für ein x, das in keinem einzigen Trainingsgitter vorkam (S. 4). Genau daran scheitern CNN-Surrogate, und genau deshalb gibt es die Bauform „</w:t>
       </w:r>
       <w:proofErr w:type="spellStart"/>
       <w:r>
@@ -813,13 +786,7 @@
       </w:r>
       <w:proofErr w:type="spellEnd"/>
       <w:r>
-        <w:t>(x) + (</w:t>
-      </w:r>
-      <w:r>
-        <w:t>𝒦</w:t>
-      </w:r>
-      <w:r>
-        <w:t>(</w:t>
+        <w:t>(x) + (𝒦(</w:t>
       </w:r>
       <w:proofErr w:type="spellStart"/>
       <w:r>
@@ -835,13 +802,7 @@
       </w:r>
       <w:proofErr w:type="spellEnd"/>
       <w:r>
-        <w:t xml:space="preserve">)(x) ). Drei Bestandteile: ein lokaler linearer Zweig W, ein globaler Integralzweig </w:t>
-      </w:r>
-      <w:r>
-        <w:t>𝒦</w:t>
-      </w:r>
-      <w:r>
-        <w:t xml:space="preserve"> und eine punktweise Nichtlinearität σ.</w:t>
+        <w:t>)(x) ). Drei Bestandteile: ein lokaler linearer Zweig W, ein globaler Integralzweig 𝒦 und eine punktweise Nichtlinearität σ.</w:t>
       </w:r>
     </w:p>
     <w:p>
@@ -1362,13 +1323,7 @@
         <w:spacing w:after="80" w:line="276" w:lineRule="auto"/>
       </w:pPr>
       <w:r>
-        <w:t>Definition 3: (</w:t>
-      </w:r>
-      <w:r>
-        <w:t>𝒦</w:t>
-      </w:r>
-      <w:r>
-        <w:t>(φ)</w:t>
+        <w:t>Definition 3: (𝒦(φ)</w:t>
       </w:r>
       <w:proofErr w:type="spellStart"/>
       <w:r>
@@ -1437,6 +1392,7 @@
         <w:spacing w:after="80" w:line="276" w:lineRule="auto"/>
       </w:pPr>
       <w:r>
+        <w:lastRenderedPageBreak/>
         <w:t xml:space="preserve">In allen Aufgaben des Papers </w:t>
       </w:r>
       <w:r>
@@ -1677,13 +1633,7 @@
         <w:spacing w:after="80" w:line="276" w:lineRule="auto"/>
       </w:pPr>
       <w:r>
-        <w:t>Parametrisierung von R: die direkte Parametrisierung ist am besten, eine lineare Abbildung ähnlich gut, eine Parametrisierung per Netz schlechter. Begründung der Autoren: die diskrete Struktur des Modenraums ℤ</w:t>
-      </w:r>
-      <w:r>
-        <w:t>ᵈ</w:t>
-      </w:r>
-      <w:r>
-        <w:t>. Dein Notizblatt gibt das richtig wieder.</w:t>
+        <w:t>Parametrisierung von R: die direkte Parametrisierung ist am besten, eine lineare Abbildung ähnlich gut, eine Parametrisierung per Netz schlechter. Begründung der Autoren: die diskrete Struktur des Modenraums ℤᵈ. Dein Notizblatt gibt das richtig wieder.</w:t>
       </w:r>
     </w:p>
     <w:p>
@@ -1696,13 +1646,7 @@
         <w:spacing w:after="80" w:line="276" w:lineRule="auto"/>
       </w:pPr>
       <w:r>
-        <w:t>Warum die Auflösungsinvarianz beinahe geschenkt kommt: die Gewichte leben im Frequenzraum, und die Rückprojektion auf die Basis der komplexen Exponentialfunktionen ist überall im ℝ</w:t>
-      </w:r>
-      <w:r>
-        <w:t>ᵈ</w:t>
-      </w:r>
-      <w:r>
-        <w:t xml:space="preserve"> definiert — und eben nicht bloß an Gitterpunkten. Deshalb funktioniert Zero-Shot-Super-Resolution.</w:t>
+        <w:t>Warum die Auflösungsinvarianz beinahe geschenkt kommt: die Gewichte leben im Frequenzraum, und die Rückprojektion auf die Basis der komplexen Exponentialfunktionen ist überall im ℝᵈ definiert — und eben nicht bloß an Gitterpunkten. Deshalb funktioniert Zero-Shot-Super-Resolution.</w:t>
       </w:r>
     </w:p>
     <w:p>
@@ -1980,6 +1924,7 @@
         <w:spacing w:before="220" w:after="120"/>
       </w:pPr>
       <w:r>
+        <w:lastRenderedPageBreak/>
         <w:t xml:space="preserve">Burgers’ </w:t>
       </w:r>
       <w:proofErr w:type="spellStart"/>
@@ -2454,6 +2399,7 @@
         <w:spacing w:after="80" w:line="276" w:lineRule="auto"/>
       </w:pPr>
       <w:r>
+        <w:lastRenderedPageBreak/>
         <w:t>Deine Beobachtung zu den mindestens 15 % Fehler bei knapper Datenlage stimmt: bei ν = 1e−4 mit N = 1000 und bei ν = 1e−5 mit N = 1000 liegen alle Verfahren darüber, wobei FNO-2D mit 0,1559 bzw. 0,1556 noch am besten wegkommt.</w:t>
       </w:r>
     </w:p>
@@ -2558,10 +2504,7 @@
       </w:r>
       <w:proofErr w:type="spellEnd"/>
       <w:r>
-        <w:t xml:space="preserve"> auf S. 3). Und be</w:t>
-      </w:r>
-      <w:r>
-        <w:t>i Burgers und Darcy ist der Fehler ebenfalls auflösungsinvariant, dort ginge Super-Resolution also genauso.</w:t>
+        <w:t xml:space="preserve"> auf S. 3). Und bei Burgers und Darcy ist der Fehler ebenfalls auflösungsinvariant, dort ginge Super-Resolution also genauso.</w:t>
       </w:r>
     </w:p>
     <w:p>
@@ -2812,10 +2755,7 @@
       </w:r>
       <w:proofErr w:type="spellEnd"/>
       <w:r>
-        <w:t xml:space="preserve">. Die Pointe daran ist die eigentlich wichtige: ein reines Abschneiden bei 20 Moden gibt rund 2 % Fehler, der FNO </w:t>
-      </w:r>
-      <w:r>
-        <w:t xml:space="preserve">mit nur 12 parametrisierten Moden landet unter 1 %. Die Aktivierungen zwischen den Schichten und das Projektionsnetz Q holen die hohen Frequenzen zurück. </w:t>
+        <w:t xml:space="preserve">. Die Pointe daran ist die eigentlich wichtige: ein reines Abschneiden bei 20 Moden gibt rund 2 % Fehler, der FNO mit nur 12 parametrisierten Moden landet unter 1 %. Die Aktivierungen zwischen den Schichten und das Projektionsnetz Q holen die hohen Frequenzen zurück. </w:t>
       </w:r>
       <w:proofErr w:type="spellStart"/>
       <w:r>
@@ -2871,6 +2811,7 @@
       </w:pPr>
       <w:proofErr w:type="gramStart"/>
       <w:r>
+        <w:lastRenderedPageBreak/>
         <w:t xml:space="preserve">2.6  </w:t>
       </w:r>
       <w:proofErr w:type="spellStart"/>
@@ -3094,13 +3035,7 @@
         <w:spacing w:after="80" w:line="276" w:lineRule="auto"/>
       </w:pPr>
       <w:r>
-        <w:t xml:space="preserve">Die Aktualisierungsvorschrift mit deiner Beschriftung: σ als lokale, nichtlineare Aktivierung, W als lineare Transformation, </w:t>
-      </w:r>
-      <w:r>
-        <w:t>𝒦</w:t>
-      </w:r>
-      <w:r>
-        <w:t xml:space="preserve"> als globaler Integraloperator für alle </w:t>
+        <w:t xml:space="preserve">Die Aktualisierungsvorschrift mit deiner Beschriftung: σ als lokale, nichtlineare Aktivierung, W als lineare Transformation, 𝒦 als globaler Integraloperator für alle </w:t>
       </w:r>
       <w:proofErr w:type="spellStart"/>
       <w:r>
@@ -3121,13 +3056,7 @@
         <w:spacing w:after="80" w:line="276" w:lineRule="auto"/>
       </w:pPr>
       <w:r>
-        <w:t>Kernel κ parametrisiert durch ein neuronales Netz mit eigenen Parametern φ ∈ Θ_</w:t>
-      </w:r>
-      <w:r>
-        <w:t>𝒦</w:t>
-      </w:r>
-      <w:r>
-        <w:t>.</w:t>
+        <w:t>Kernel κ parametrisiert durch ein neuronales Netz mit eigenen Parametern φ ∈ Θ_𝒦.</w:t>
       </w:r>
     </w:p>
     <w:p>
@@ -3309,87 +3238,51 @@
       </w:r>
       <w:proofErr w:type="gramStart"/>
       <w:r>
-        <w:t>𝒦</w:t>
-      </w:r>
-      <w:r>
-        <w:t xml:space="preserve"> :</w:t>
+        <w:t>𝒦 :</w:t>
       </w:r>
       <w:proofErr w:type="gramEnd"/>
       <w:r>
-        <w:t xml:space="preserve"> </w:t>
-      </w:r>
-      <w:r>
-        <w:t>𝒜</w:t>
-      </w:r>
-      <w:r>
-        <w:t xml:space="preserve"> × Θ_</w:t>
-      </w:r>
-      <w:r>
-        <w:t>𝒦</w:t>
-      </w:r>
-      <w:r>
-        <w:t xml:space="preserve"> → L( </w:t>
-      </w:r>
-      <w:r>
-        <w:t>𝒰</w:t>
-      </w:r>
+        <w:t xml:space="preserve"> 𝒜 × Θ_𝒦 → L( 𝒰(D; ℝ^{</w:t>
+      </w:r>
+      <w:proofErr w:type="spellStart"/>
+      <w:r>
+        <w:t>d_a</w:t>
+      </w:r>
+      <w:proofErr w:type="spellEnd"/>
+      <w:r>
+        <w:t>}), 𝒰(D; ℝ^{</w:t>
+      </w:r>
+      <w:proofErr w:type="spellStart"/>
+      <w:r>
+        <w:t>d_v</w:t>
+      </w:r>
+      <w:proofErr w:type="spellEnd"/>
+      <w:r>
+        <w:t xml:space="preserve">}) ). Im Paper steht beide Male </w:t>
+      </w:r>
+      <w:proofErr w:type="spellStart"/>
+      <w:r>
+        <w:t>d_v</w:t>
+      </w:r>
+      <w:proofErr w:type="spellEnd"/>
+      <w:r>
+        <w:t xml:space="preserve">: </w:t>
+      </w:r>
+      <w:proofErr w:type="gramStart"/>
+      <w:r>
+        <w:t>L( 𝒰</w:t>
+      </w:r>
+      <w:proofErr w:type="gramEnd"/>
       <w:r>
         <w:t>(D; ℝ^{</w:t>
       </w:r>
       <w:proofErr w:type="spellStart"/>
       <w:r>
-        <w:t>d_a</w:t>
-      </w:r>
-      <w:proofErr w:type="spellEnd"/>
-      <w:r>
-        <w:t xml:space="preserve">}), </w:t>
-      </w:r>
-      <w:r>
-        <w:t>𝒰</w:t>
-      </w:r>
-      <w:r>
-        <w:t>(D; ℝ^{</w:t>
-      </w:r>
-      <w:proofErr w:type="spellStart"/>
-      <w:r>
         <w:t>d_v</w:t>
       </w:r>
       <w:proofErr w:type="spellEnd"/>
       <w:r>
-        <w:t xml:space="preserve">}) ). Im Paper steht beide Male </w:t>
-      </w:r>
-      <w:proofErr w:type="spellStart"/>
-      <w:r>
-        <w:t>d_v</w:t>
-      </w:r>
-      <w:proofErr w:type="spellEnd"/>
-      <w:r>
-        <w:t xml:space="preserve">: </w:t>
-      </w:r>
-      <w:proofErr w:type="gramStart"/>
-      <w:r>
-        <w:t xml:space="preserve">L( </w:t>
-      </w:r>
-      <w:r>
-        <w:t>𝒰</w:t>
-      </w:r>
-      <w:proofErr w:type="gramEnd"/>
-      <w:r>
-        <w:t>(D; ℝ^{</w:t>
-      </w:r>
-      <w:proofErr w:type="spellStart"/>
-      <w:r>
-        <w:t>d_v</w:t>
-      </w:r>
-      <w:proofErr w:type="spellEnd"/>
-      <w:r>
-        <w:t xml:space="preserve">}), </w:t>
-      </w:r>
-      <w:r>
-        <w:t>𝒰</w:t>
-      </w:r>
-      <w:r>
-        <w:t>(D; ℝ^{</w:t>
+        <w:t>}), 𝒰(D; ℝ^{</w:t>
       </w:r>
       <w:proofErr w:type="spellStart"/>
       <w:r>
@@ -3426,13 +3319,7 @@
         <w:t xml:space="preserve">2. </w:t>
       </w:r>
       <w:r>
-        <w:t>Deine Zeile „</w:t>
-      </w:r>
-      <w:r>
-        <w:t>𝒦</w:t>
-      </w:r>
-      <w:r>
-        <w:t>(</w:t>
+        <w:t>Deine Zeile „𝒦(</w:t>
       </w:r>
       <w:proofErr w:type="spellStart"/>
       <w:proofErr w:type="gramStart"/>
@@ -3543,10 +3430,7 @@
       </w:r>
       <w:proofErr w:type="spellEnd"/>
       <w:r>
-        <w:t>(x). Richtig ist: hin mit e^{−2iπ</w:t>
-      </w:r>
-      <w:r>
-        <w:t>⟨</w:t>
+        <w:t>(x). Richtig ist: hin mit e^{−2iπ⟨</w:t>
       </w:r>
       <w:proofErr w:type="spellStart"/>
       <w:proofErr w:type="gramStart"/>
@@ -3556,13 +3440,7 @@
       <w:proofErr w:type="spellEnd"/>
       <w:proofErr w:type="gramEnd"/>
       <w:r>
-        <w:t>⟩</w:t>
-      </w:r>
-      <w:r>
-        <w:t>} und dx über D, zurück mit e^{+2iπ</w:t>
-      </w:r>
-      <w:r>
-        <w:t>⟨</w:t>
+        <w:t>⟩} und dx über D, zurück mit e^{+2iπ⟨</w:t>
       </w:r>
       <w:proofErr w:type="spellStart"/>
       <w:r>
@@ -3570,10 +3448,7 @@
       </w:r>
       <w:proofErr w:type="spellEnd"/>
       <w:r>
-        <w:t>⟩</w:t>
-      </w:r>
-      <w:r>
-        <w:t xml:space="preserve">} und </w:t>
+        <w:t xml:space="preserve">⟩} und </w:t>
       </w:r>
       <w:proofErr w:type="spellStart"/>
       <w:r>
@@ -3612,6 +3487,7 @@
       </w:pPr>
       <w:proofErr w:type="gramStart"/>
       <w:r>
+        <w:lastRenderedPageBreak/>
         <w:t>3.3  Was</w:t>
       </w:r>
       <w:proofErr w:type="gramEnd"/>
@@ -4104,6 +3980,7 @@
         <w:spacing w:after="80" w:line="276" w:lineRule="auto"/>
       </w:pPr>
       <w:r>
+        <w:lastRenderedPageBreak/>
         <w:t xml:space="preserve">Zweitens: Weil das </w:t>
       </w:r>
       <w:r>
@@ -4544,12 +4421,6 @@
         <w:gridCol w:w="2400"/>
       </w:tblGrid>
       <w:tr>
-        <w:tblPrEx>
-          <w:tblCellMar>
-            <w:top w:w="0" w:type="dxa"/>
-            <w:bottom w:w="0" w:type="dxa"/>
-          </w:tblCellMar>
-        </w:tblPrEx>
         <w:trPr>
           <w:tblHeader/>
         </w:trPr>
@@ -4575,6 +4446,7 @@
                 <w:sz w:val="19"/>
                 <w:szCs w:val="19"/>
               </w:rPr>
+              <w:lastRenderedPageBreak/>
               <w:t>Angabe</w:t>
             </w:r>
           </w:p>
@@ -4633,12 +4505,6 @@
         </w:tc>
       </w:tr>
       <w:tr>
-        <w:tblPrEx>
-          <w:tblCellMar>
-            <w:top w:w="0" w:type="dxa"/>
-            <w:bottom w:w="0" w:type="dxa"/>
-          </w:tblCellMar>
-        </w:tblPrEx>
         <w:tc>
           <w:tcPr>
             <w:tcW w:w="2600" w:type="dxa"/>
@@ -4746,12 +4612,6 @@
         </w:tc>
       </w:tr>
       <w:tr>
-        <w:tblPrEx>
-          <w:tblCellMar>
-            <w:top w:w="0" w:type="dxa"/>
-            <w:bottom w:w="0" w:type="dxa"/>
-          </w:tblCellMar>
-        </w:tblPrEx>
         <w:tc>
           <w:tcPr>
             <w:tcW w:w="2600" w:type="dxa"/>
@@ -4845,12 +4705,6 @@
         </w:tc>
       </w:tr>
       <w:tr>
-        <w:tblPrEx>
-          <w:tblCellMar>
-            <w:top w:w="0" w:type="dxa"/>
-            <w:bottom w:w="0" w:type="dxa"/>
-          </w:tblCellMar>
-        </w:tblPrEx>
         <w:tc>
           <w:tcPr>
             <w:tcW w:w="2600" w:type="dxa"/>
@@ -4926,12 +4780,6 @@
         </w:tc>
       </w:tr>
       <w:tr>
-        <w:tblPrEx>
-          <w:tblCellMar>
-            <w:top w:w="0" w:type="dxa"/>
-            <w:bottom w:w="0" w:type="dxa"/>
-          </w:tblCellMar>
-        </w:tblPrEx>
         <w:tc>
           <w:tcPr>
             <w:tcW w:w="2600" w:type="dxa"/>
@@ -5019,12 +4867,6 @@
         </w:tc>
       </w:tr>
       <w:tr>
-        <w:tblPrEx>
-          <w:tblCellMar>
-            <w:top w:w="0" w:type="dxa"/>
-            <w:bottom w:w="0" w:type="dxa"/>
-          </w:tblCellMar>
-        </w:tblPrEx>
         <w:tc>
           <w:tcPr>
             <w:tcW w:w="2600" w:type="dxa"/>
@@ -5096,12 +4938,6 @@
         </w:tc>
       </w:tr>
       <w:tr>
-        <w:tblPrEx>
-          <w:tblCellMar>
-            <w:top w:w="0" w:type="dxa"/>
-            <w:bottom w:w="0" w:type="dxa"/>
-          </w:tblCellMar>
-        </w:tblPrEx>
         <w:tc>
           <w:tcPr>
             <w:tcW w:w="2600" w:type="dxa"/>
@@ -5173,12 +5009,6 @@
         </w:tc>
       </w:tr>
       <w:tr>
-        <w:tblPrEx>
-          <w:tblCellMar>
-            <w:top w:w="0" w:type="dxa"/>
-            <w:bottom w:w="0" w:type="dxa"/>
-          </w:tblCellMar>
-        </w:tblPrEx>
         <w:tc>
           <w:tcPr>
             <w:tcW w:w="2600" w:type="dxa"/>
@@ -5250,12 +5080,6 @@
         </w:tc>
       </w:tr>
       <w:tr>
-        <w:tblPrEx>
-          <w:tblCellMar>
-            <w:top w:w="0" w:type="dxa"/>
-            <w:bottom w:w="0" w:type="dxa"/>
-          </w:tblCellMar>
-        </w:tblPrEx>
         <w:tc>
           <w:tcPr>
             <w:tcW w:w="2600" w:type="dxa"/>
@@ -5331,12 +5155,6 @@
         </w:tc>
       </w:tr>
       <w:tr>
-        <w:tblPrEx>
-          <w:tblCellMar>
-            <w:top w:w="0" w:type="dxa"/>
-            <w:bottom w:w="0" w:type="dxa"/>
-          </w:tblCellMar>
-        </w:tblPrEx>
         <w:tc>
           <w:tcPr>
             <w:tcW w:w="2600" w:type="dxa"/>
@@ -5450,12 +5268,6 @@
         </w:tc>
       </w:tr>
       <w:tr>
-        <w:tblPrEx>
-          <w:tblCellMar>
-            <w:top w:w="0" w:type="dxa"/>
-            <w:bottom w:w="0" w:type="dxa"/>
-          </w:tblCellMar>
-        </w:tblPrEx>
         <w:tc>
           <w:tcPr>
             <w:tcW w:w="2600" w:type="dxa"/>
@@ -5527,12 +5339,6 @@
         </w:tc>
       </w:tr>
       <w:tr>
-        <w:tblPrEx>
-          <w:tblCellMar>
-            <w:top w:w="0" w:type="dxa"/>
-            <w:bottom w:w="0" w:type="dxa"/>
-          </w:tblCellMar>
-        </w:tblPrEx>
         <w:tc>
           <w:tcPr>
             <w:tcW w:w="2600" w:type="dxa"/>
@@ -5604,12 +5410,6 @@
         </w:tc>
       </w:tr>
       <w:tr>
-        <w:tblPrEx>
-          <w:tblCellMar>
-            <w:top w:w="0" w:type="dxa"/>
-            <w:bottom w:w="0" w:type="dxa"/>
-          </w:tblCellMar>
-        </w:tblPrEx>
         <w:tc>
           <w:tcPr>
             <w:tcW w:w="2600" w:type="dxa"/>
@@ -5681,12 +5481,6 @@
         </w:tc>
       </w:tr>
       <w:tr>
-        <w:tblPrEx>
-          <w:tblCellMar>
-            <w:top w:w="0" w:type="dxa"/>
-            <w:bottom w:w="0" w:type="dxa"/>
-          </w:tblCellMar>
-        </w:tblPrEx>
         <w:tc>
           <w:tcPr>
             <w:tcW w:w="2600" w:type="dxa"/>
@@ -5783,10 +5577,226 @@
           </w:p>
         </w:tc>
       </w:tr>
+      <w:tr>
+        <w:tc>
+          <w:tcPr>
+            <w:tcW w:w="2600" w:type="dxa"/>
+            <w:tcMar>
+              <w:top w:w="80" w:type="dxa"/>
+              <w:left w:w="110" w:type="dxa"/>
+              <w:bottom w:w="80" w:type="dxa"/>
+              <w:right w:w="110" w:type="dxa"/>
+            </w:tcMar>
+          </w:tcPr>
+          <w:p>
+            <w:pPr>
+              <w:spacing w:line="250" w:lineRule="auto"/>
+              <w:rPr>
+                <w:sz w:val="19"/>
+                <w:szCs w:val="19"/>
+              </w:rPr>
+            </w:pPr>
+            <w:r>
+              <w:rPr>
+                <w:sz w:val="19"/>
+                <w:szCs w:val="19"/>
+                <w:lang w:val="en-US"/>
+              </w:rPr>
+              <w:t>Non-periodic boundary condition</w:t>
+            </w:r>
+          </w:p>
+        </w:tc>
+        <w:tc>
+          <w:tcPr>
+            <w:tcW w:w="4000" w:type="dxa"/>
+            <w:tcMar>
+              <w:top w:w="80" w:type="dxa"/>
+              <w:left w:w="110" w:type="dxa"/>
+              <w:bottom w:w="80" w:type="dxa"/>
+              <w:right w:w="110" w:type="dxa"/>
+            </w:tcMar>
+          </w:tcPr>
+          <w:p>
+            <w:pPr>
+              <w:spacing w:line="250" w:lineRule="auto"/>
+              <w:rPr>
+                <w:sz w:val="19"/>
+                <w:szCs w:val="19"/>
+                <w:lang w:val="en-US"/>
+              </w:rPr>
+            </w:pPr>
+            <w:r>
+              <w:rPr>
+                <w:sz w:val="19"/>
+                <w:szCs w:val="19"/>
+                <w:lang w:val="en-US"/>
+              </w:rPr>
+              <w:t>“</w:t>
+            </w:r>
+            <w:r>
+              <w:rPr>
+                <w:sz w:val="19"/>
+                <w:szCs w:val="19"/>
+                <w:lang w:val="en-US"/>
+              </w:rPr>
+              <w:t>Traditional Fourier methods work only with periodic boundary</w:t>
+            </w:r>
+            <w:r>
+              <w:rPr>
+                <w:sz w:val="19"/>
+                <w:szCs w:val="19"/>
+                <w:lang w:val="en-US"/>
+              </w:rPr>
+              <w:t xml:space="preserve"> </w:t>
+            </w:r>
+            <w:r>
+              <w:rPr>
+                <w:sz w:val="19"/>
+                <w:szCs w:val="19"/>
+                <w:lang w:val="en-US"/>
+              </w:rPr>
+              <w:t xml:space="preserve">conditions. However, the </w:t>
+            </w:r>
+            <w:r>
+              <w:rPr>
+                <w:sz w:val="19"/>
+                <w:szCs w:val="19"/>
+                <w:highlight w:val="yellow"/>
+                <w:lang w:val="en-US"/>
+              </w:rPr>
+              <w:t>Fourier neural operator does not have this limitation. This is due to the</w:t>
+            </w:r>
+            <w:r>
+              <w:rPr>
+                <w:sz w:val="19"/>
+                <w:szCs w:val="19"/>
+                <w:highlight w:val="yellow"/>
+                <w:lang w:val="en-US"/>
+              </w:rPr>
+              <w:t xml:space="preserve"> </w:t>
+            </w:r>
+            <w:r>
+              <w:rPr>
+                <w:sz w:val="19"/>
+                <w:szCs w:val="19"/>
+                <w:highlight w:val="yellow"/>
+                <w:lang w:val="en-US"/>
+              </w:rPr>
+              <w:t>linear transform W (the bias term) which keeps the track of non-periodic boundary.</w:t>
+            </w:r>
+            <w:r>
+              <w:rPr>
+                <w:sz w:val="19"/>
+                <w:szCs w:val="19"/>
+                <w:lang w:val="en-US"/>
+              </w:rPr>
+              <w:t xml:space="preserve"> As an exa</w:t>
+            </w:r>
+            <w:r>
+              <w:rPr>
+                <w:sz w:val="19"/>
+                <w:szCs w:val="19"/>
+                <w:lang w:val="en-US"/>
+              </w:rPr>
+              <w:t>m</w:t>
+            </w:r>
+            <w:r>
+              <w:rPr>
+                <w:sz w:val="19"/>
+                <w:szCs w:val="19"/>
+                <w:lang w:val="en-US"/>
+              </w:rPr>
+              <w:t>ple,</w:t>
+            </w:r>
+            <w:r>
+              <w:rPr>
+                <w:sz w:val="19"/>
+                <w:szCs w:val="19"/>
+                <w:lang w:val="en-US"/>
+              </w:rPr>
+              <w:t xml:space="preserve"> </w:t>
+            </w:r>
+            <w:r>
+              <w:rPr>
+                <w:sz w:val="19"/>
+                <w:szCs w:val="19"/>
+                <w:lang w:val="en-US"/>
+              </w:rPr>
+              <w:t>the Darcy Flow and the time domain of Navier-Stokes have non-periodic boundary conditions, and</w:t>
+            </w:r>
+            <w:r>
+              <w:rPr>
+                <w:sz w:val="19"/>
+                <w:szCs w:val="19"/>
+                <w:lang w:val="en-US"/>
+              </w:rPr>
+              <w:t xml:space="preserve"> </w:t>
+            </w:r>
+            <w:r>
+              <w:rPr>
+                <w:sz w:val="19"/>
+                <w:szCs w:val="19"/>
+                <w:lang w:val="en-US"/>
+              </w:rPr>
+              <w:t>the Fourier neural operator still learns the solution operator with excellent accuracy.</w:t>
+            </w:r>
+            <w:r>
+              <w:rPr>
+                <w:sz w:val="19"/>
+                <w:szCs w:val="19"/>
+                <w:lang w:val="en-US"/>
+              </w:rPr>
+              <w:t>”</w:t>
+            </w:r>
+          </w:p>
+        </w:tc>
+        <w:tc>
+          <w:tcPr>
+            <w:tcW w:w="2400" w:type="dxa"/>
+            <w:tcMar>
+              <w:top w:w="80" w:type="dxa"/>
+              <w:left w:w="110" w:type="dxa"/>
+              <w:bottom w:w="80" w:type="dxa"/>
+              <w:right w:w="110" w:type="dxa"/>
+            </w:tcMar>
+          </w:tcPr>
+          <w:p>
+            <w:pPr>
+              <w:spacing w:line="250" w:lineRule="auto"/>
+              <w:rPr>
+                <w:sz w:val="19"/>
+                <w:szCs w:val="19"/>
+                <w:lang w:val="en-US"/>
+              </w:rPr>
+            </w:pPr>
+            <w:proofErr w:type="spellStart"/>
+            <w:r>
+              <w:rPr>
+                <w:sz w:val="19"/>
+                <w:szCs w:val="19"/>
+                <w:lang w:val="en-US"/>
+              </w:rPr>
+              <w:t>Kap</w:t>
+            </w:r>
+            <w:proofErr w:type="spellEnd"/>
+            <w:r>
+              <w:rPr>
+                <w:sz w:val="19"/>
+                <w:szCs w:val="19"/>
+                <w:lang w:val="en-US"/>
+              </w:rPr>
+              <w:t>. 5.5 S. 9</w:t>
+            </w:r>
+          </w:p>
+        </w:tc>
+      </w:tr>
     </w:tbl>
     <w:p>
       <w:pPr>
         <w:spacing w:after="120"/>
+        <w:rPr>
+          <w:lang w:val="en-US"/>
+        </w:rPr>
       </w:pPr>
     </w:p>
     <w:p>
@@ -5886,6 +5896,7 @@
       </w:pPr>
       <w:proofErr w:type="spellStart"/>
       <w:r>
+        <w:lastRenderedPageBreak/>
         <w:t>cloud_in_cell_charge_deposition</w:t>
       </w:r>
       <w:proofErr w:type="spellEnd"/>
@@ -6164,10 +6175,7 @@
       </w:pPr>
       <w:proofErr w:type="gramStart"/>
       <w:r>
-        <w:t>7</w:t>
-      </w:r>
-      <w:r>
-        <w:t>.2  Die</w:t>
+        <w:t>7.2  Die</w:t>
       </w:r>
       <w:proofErr w:type="gramEnd"/>
       <w:r>
@@ -6533,6 +6541,7 @@
         <w:rPr>
           <w:highlight w:val="magenta"/>
         </w:rPr>
+        <w:lastRenderedPageBreak/>
         <w:t>offenen Randbedingungen sind der Grund, warum Cheetah überhaupt den Hockney-Kniff mit dem verdoppelten Gitter braucht</w:t>
       </w:r>
       <w:r>
@@ -6695,12 +6704,6 @@
         <w:gridCol w:w="2800"/>
       </w:tblGrid>
       <w:tr>
-        <w:tblPrEx>
-          <w:tblCellMar>
-            <w:top w:w="0" w:type="dxa"/>
-            <w:bottom w:w="0" w:type="dxa"/>
-          </w:tblCellMar>
-        </w:tblPrEx>
         <w:trPr>
           <w:tblHeader/>
         </w:trPr>
@@ -6810,12 +6813,6 @@
         </w:tc>
       </w:tr>
       <w:tr>
-        <w:tblPrEx>
-          <w:tblCellMar>
-            <w:top w:w="0" w:type="dxa"/>
-            <w:bottom w:w="0" w:type="dxa"/>
-          </w:tblCellMar>
-        </w:tblPrEx>
         <w:tc>
           <w:tcPr>
             <w:tcW w:w="900" w:type="dxa"/>
@@ -6910,12 +6907,6 @@
         </w:tc>
       </w:tr>
       <w:tr>
-        <w:tblPrEx>
-          <w:tblCellMar>
-            <w:top w:w="0" w:type="dxa"/>
-            <w:bottom w:w="0" w:type="dxa"/>
-          </w:tblCellMar>
-        </w:tblPrEx>
         <w:tc>
           <w:tcPr>
             <w:tcW w:w="900" w:type="dxa"/>
@@ -7058,12 +7049,6 @@
         </w:tc>
       </w:tr>
       <w:tr>
-        <w:tblPrEx>
-          <w:tblCellMar>
-            <w:top w:w="0" w:type="dxa"/>
-            <w:bottom w:w="0" w:type="dxa"/>
-          </w:tblCellMar>
-        </w:tblPrEx>
         <w:tc>
           <w:tcPr>
             <w:tcW w:w="900" w:type="dxa"/>
@@ -7174,12 +7159,6 @@
         </w:tc>
       </w:tr>
       <w:tr>
-        <w:tblPrEx>
-          <w:tblCellMar>
-            <w:top w:w="0" w:type="dxa"/>
-            <w:bottom w:w="0" w:type="dxa"/>
-          </w:tblCellMar>
-        </w:tblPrEx>
         <w:tc>
           <w:tcPr>
             <w:tcW w:w="900" w:type="dxa"/>
@@ -7399,7 +7378,11 @@
         <w:t>gemessen</w:t>
       </w:r>
       <w:r>
-        <w:t>, bevor du irgendetwas versprichst. Und ein ehrliches „der Vorwärtsdurchlauf gewinnt nichts, der Rückwärtsdurchlauf um Faktor X" ist ein gutes Ergebnis, kein schlechtes.</w:t>
+        <w:t xml:space="preserve">, bevor du irgendetwas versprichst. Und ein ehrliches „der </w:t>
+      </w:r>
+      <w:r>
+        <w:lastRenderedPageBreak/>
+        <w:t>Vorwärtsdurchlauf gewinnt nichts, der Rückwärtsdurchlauf um Faktor X" ist ein gutes Ergebnis, kein schlechtes.</w:t>
       </w:r>
     </w:p>
     <w:p>
@@ -7585,10 +7568,7 @@
       </w:pPr>
       <w:proofErr w:type="gramStart"/>
       <w:r>
-        <w:t>7</w:t>
-      </w:r>
-      <w:r>
-        <w:t>.6  Antwort</w:t>
+        <w:t>7.6  Antwort</w:t>
       </w:r>
       <w:proofErr w:type="gramEnd"/>
       <w:r>
@@ -7756,10 +7736,7 @@
         <w:spacing w:after="120" w:line="276" w:lineRule="auto"/>
       </w:pPr>
       <w:r>
-        <w:t>D</w:t>
-      </w:r>
-      <w:r>
-        <w:t>as ist der Satz, mit dem du den Zusatznutzen begründest: Es geht nicht darum, die Simulation durch ein Netz zu ersetzen, sondern darum, den teuersten physikalischen Baustein in der Simulation gegen einen billigeren, differenzierbaren auszutauschen — bei gleichbleibender Struktur.</w:t>
+        <w:t>Das ist der Satz, mit dem du den Zusatznutzen begründest: Es geht nicht darum, die Simulation durch ein Netz zu ersetzen, sondern darum, den teuersten physikalischen Baustein in der Simulation gegen einen billigeren, differenzierbaren auszutauschen — bei gleichbleibender Struktur.</w:t>
       </w:r>
     </w:p>
     <w:p>
@@ -7848,6 +7825,7 @@
         <w:spacing w:after="80" w:line="276" w:lineRule="auto"/>
       </w:pPr>
       <w:r>
+        <w:lastRenderedPageBreak/>
         <w:t xml:space="preserve">Das passende Gegenstück im Paper ist </w:t>
       </w:r>
       <w:r>
@@ -7992,10 +7970,7 @@
       </w:pPr>
       <w:proofErr w:type="gramStart"/>
       <w:r>
-        <w:t>8</w:t>
-      </w:r>
-      <w:r>
-        <w:t xml:space="preserve">  Nächste</w:t>
+        <w:t>8  Nächste</w:t>
       </w:r>
       <w:proofErr w:type="gramEnd"/>
       <w:r>
@@ -8278,15 +8253,7 @@
         <w:annotationRef/>
       </w:r>
       <w:r>
-        <w:t xml:space="preserve">Prüfen in Kaiser oder </w:t>
-      </w:r>
-      <w:proofErr w:type="spellStart"/>
-      <w:r>
-        <w:t>Dhamrait</w:t>
-      </w:r>
-      <w:proofErr w:type="spellEnd"/>
-      <w:r>
-        <w:t xml:space="preserve"> oder Jan selber fragen</w:t>
+        <w:t>Prüfen in Kaiser oder Dhamrait oder Jan selber fragen</w:t>
       </w:r>
     </w:p>
   </w:comment>
@@ -8303,15 +8270,7 @@
         <w:annotationRef/>
       </w:r>
       <w:r>
-        <w:t xml:space="preserve">FNO brauchen keine </w:t>
-      </w:r>
-      <w:proofErr w:type="spellStart"/>
-      <w:r>
-        <w:t>Randbed</w:t>
-      </w:r>
-      <w:proofErr w:type="spellEnd"/>
-      <w:r>
-        <w:t>. Wegen linearer Transformation W</w:t>
+        <w:t>FNO brauchen keine Randbed. Wegen linearer Transformation W</w:t>
       </w:r>
     </w:p>
   </w:comment>
@@ -8329,13 +8288,8 @@
       <w:r>
         <w:t xml:space="preserve">d.h. Beschränkung auf max. </w:t>
       </w:r>
-      <w:proofErr w:type="spellStart"/>
-      <w:r>
-        <w:t>k_max</w:t>
-      </w:r>
-      <w:proofErr w:type="spellEnd"/>
-      <w:r>
-        <w:t xml:space="preserve"> Moden, anstatt alle Frequenzmoden in der Fourier-Definition aufzulisten</w:t>
+      <w:r>
+        <w:t>k_max Moden, anstatt alle Frequenzmoden in der Fourier-Definition aufzulisten</w:t>
       </w:r>
     </w:p>
   </w:comment>
@@ -9784,7 +9738,6 @@
   <w:style w:type="character" w:default="1" w:styleId="Absatz-Standardschriftart">
     <w:name w:val="Default Paragraph Font"/>
     <w:uiPriority w:val="1"/>
-    <w:semiHidden/>
     <w:unhideWhenUsed/>
   </w:style>
   <w:style w:type="table" w:default="1" w:styleId="NormaleTabelle">

</xml_diff>